<commit_message>
Week 4 log book
</commit_message>
<xml_diff>
--- a/LABlogbook.docx
+++ b/LABlogbook.docx
@@ -710,6 +710,7 @@
       </w:pPr>
       <w:r>
         <w:rPr>
+          <w:noProof/>
           <w:sz w:val="44"/>
           <w:szCs w:val="44"/>
           <w:u w:val="single"/>
@@ -768,6 +769,69 @@
         </w:rPr>
         <w:t>Lab 4</w:t>
       </w:r>
+    </w:p>
+    <w:p>
+      <w:pPr>
+        <w:jc w:val="both"/>
+        <w:rPr>
+          <w:sz w:val="44"/>
+          <w:szCs w:val="44"/>
+          <w:u w:val="single"/>
+        </w:rPr>
+      </w:pPr>
+      <w:r>
+        <w:rPr>
+          <w:sz w:val="44"/>
+          <w:szCs w:val="44"/>
+          <w:u w:val="single"/>
+        </w:rPr>
+        <w:lastRenderedPageBreak/>
+        <w:drawing>
+          <wp:inline distT="0" distB="0" distL="0" distR="0" wp14:anchorId="628AB00C" wp14:editId="3E52C608">
+            <wp:extent cx="5731510" cy="3613785"/>
+            <wp:effectExtent l="0" t="0" r="2540" b="5715"/>
+            <wp:docPr id="515590906" name="Picture 1"/>
+            <wp:cNvGraphicFramePr>
+              <a:graphicFrameLocks xmlns:a="http://schemas.openxmlformats.org/drawingml/2006/main" noChangeAspect="1"/>
+            </wp:cNvGraphicFramePr>
+            <a:graphic xmlns:a="http://schemas.openxmlformats.org/drawingml/2006/main">
+              <a:graphicData uri="http://schemas.openxmlformats.org/drawingml/2006/picture">
+                <pic:pic xmlns:pic="http://schemas.openxmlformats.org/drawingml/2006/picture">
+                  <pic:nvPicPr>
+                    <pic:cNvPr id="515590906" name=""/>
+                    <pic:cNvPicPr/>
+                  </pic:nvPicPr>
+                  <pic:blipFill>
+                    <a:blip r:embed="rId14"/>
+                    <a:stretch>
+                      <a:fillRect/>
+                    </a:stretch>
+                  </pic:blipFill>
+                  <pic:spPr>
+                    <a:xfrm>
+                      <a:off x="0" y="0"/>
+                      <a:ext cx="5731510" cy="3613785"/>
+                    </a:xfrm>
+                    <a:prstGeom prst="rect">
+                      <a:avLst/>
+                    </a:prstGeom>
+                  </pic:spPr>
+                </pic:pic>
+              </a:graphicData>
+            </a:graphic>
+          </wp:inline>
+        </w:drawing>
+      </w:r>
+    </w:p>
+    <w:p>
+      <w:pPr>
+        <w:jc w:val="both"/>
+        <w:rPr>
+          <w:sz w:val="44"/>
+          <w:szCs w:val="44"/>
+          <w:u w:val="single"/>
+        </w:rPr>
+      </w:pPr>
     </w:p>
     <w:p>
       <w:pPr>

</xml_diff>

<commit_message>
add week 12 logbook
</commit_message>
<xml_diff>
--- a/LABlogbook.docx
+++ b/LABlogbook.docx
@@ -2128,6 +2128,7 @@
       </w:pPr>
       <w:r>
         <w:rPr>
+          <w:noProof/>
           <w:sz w:val="44"/>
           <w:szCs w:val="44"/>
         </w:rPr>
@@ -2187,7 +2188,243 @@
         <w:t>Lab 12</w:t>
       </w:r>
     </w:p>
+    <w:p>
+      <w:r>
+        <w:drawing>
+          <wp:inline distT="0" distB="0" distL="0" distR="0" wp14:anchorId="3A10CF1B" wp14:editId="78E88CBB">
+            <wp:extent cx="5731510" cy="3188335"/>
+            <wp:effectExtent l="0" t="0" r="2540" b="0"/>
+            <wp:docPr id="700216370" name="Picture 1"/>
+            <wp:cNvGraphicFramePr>
+              <a:graphicFrameLocks xmlns:a="http://schemas.openxmlformats.org/drawingml/2006/main" noChangeAspect="1"/>
+            </wp:cNvGraphicFramePr>
+            <a:graphic xmlns:a="http://schemas.openxmlformats.org/drawingml/2006/main">
+              <a:graphicData uri="http://schemas.openxmlformats.org/drawingml/2006/picture">
+                <pic:pic xmlns:pic="http://schemas.openxmlformats.org/drawingml/2006/picture">
+                  <pic:nvPicPr>
+                    <pic:cNvPr id="700216370" name=""/>
+                    <pic:cNvPicPr/>
+                  </pic:nvPicPr>
+                  <pic:blipFill>
+                    <a:blip r:embed="rId31"/>
+                    <a:stretch>
+                      <a:fillRect/>
+                    </a:stretch>
+                  </pic:blipFill>
+                  <pic:spPr>
+                    <a:xfrm>
+                      <a:off x="0" y="0"/>
+                      <a:ext cx="5731510" cy="3188335"/>
+                    </a:xfrm>
+                    <a:prstGeom prst="rect">
+                      <a:avLst/>
+                    </a:prstGeom>
+                  </pic:spPr>
+                </pic:pic>
+              </a:graphicData>
+            </a:graphic>
+          </wp:inline>
+        </w:drawing>
+      </w:r>
+    </w:p>
+    <w:p>
+      <w:r>
+        <w:drawing>
+          <wp:inline distT="0" distB="0" distL="0" distR="0" wp14:anchorId="3143A669" wp14:editId="04505016">
+            <wp:extent cx="5731510" cy="1621155"/>
+            <wp:effectExtent l="0" t="0" r="2540" b="0"/>
+            <wp:docPr id="1012012879" name="Picture 1"/>
+            <wp:cNvGraphicFramePr>
+              <a:graphicFrameLocks xmlns:a="http://schemas.openxmlformats.org/drawingml/2006/main" noChangeAspect="1"/>
+            </wp:cNvGraphicFramePr>
+            <a:graphic xmlns:a="http://schemas.openxmlformats.org/drawingml/2006/main">
+              <a:graphicData uri="http://schemas.openxmlformats.org/drawingml/2006/picture">
+                <pic:pic xmlns:pic="http://schemas.openxmlformats.org/drawingml/2006/picture">
+                  <pic:nvPicPr>
+                    <pic:cNvPr id="1012012879" name=""/>
+                    <pic:cNvPicPr/>
+                  </pic:nvPicPr>
+                  <pic:blipFill>
+                    <a:blip r:embed="rId32"/>
+                    <a:stretch>
+                      <a:fillRect/>
+                    </a:stretch>
+                  </pic:blipFill>
+                  <pic:spPr>
+                    <a:xfrm>
+                      <a:off x="0" y="0"/>
+                      <a:ext cx="5731510" cy="1621155"/>
+                    </a:xfrm>
+                    <a:prstGeom prst="rect">
+                      <a:avLst/>
+                    </a:prstGeom>
+                  </pic:spPr>
+                </pic:pic>
+              </a:graphicData>
+            </a:graphic>
+          </wp:inline>
+        </w:drawing>
+      </w:r>
+    </w:p>
+    <w:p>
+      <w:r>
+        <w:lastRenderedPageBreak/>
+        <w:drawing>
+          <wp:inline distT="0" distB="0" distL="0" distR="0" wp14:anchorId="12AF0BEB" wp14:editId="683078A4">
+            <wp:extent cx="5731510" cy="3860165"/>
+            <wp:effectExtent l="0" t="0" r="2540" b="6985"/>
+            <wp:docPr id="338495047" name="Picture 1"/>
+            <wp:cNvGraphicFramePr>
+              <a:graphicFrameLocks xmlns:a="http://schemas.openxmlformats.org/drawingml/2006/main" noChangeAspect="1"/>
+            </wp:cNvGraphicFramePr>
+            <a:graphic xmlns:a="http://schemas.openxmlformats.org/drawingml/2006/main">
+              <a:graphicData uri="http://schemas.openxmlformats.org/drawingml/2006/picture">
+                <pic:pic xmlns:pic="http://schemas.openxmlformats.org/drawingml/2006/picture">
+                  <pic:nvPicPr>
+                    <pic:cNvPr id="338495047" name=""/>
+                    <pic:cNvPicPr/>
+                  </pic:nvPicPr>
+                  <pic:blipFill>
+                    <a:blip r:embed="rId33"/>
+                    <a:stretch>
+                      <a:fillRect/>
+                    </a:stretch>
+                  </pic:blipFill>
+                  <pic:spPr>
+                    <a:xfrm>
+                      <a:off x="0" y="0"/>
+                      <a:ext cx="5731510" cy="3860165"/>
+                    </a:xfrm>
+                    <a:prstGeom prst="rect">
+                      <a:avLst/>
+                    </a:prstGeom>
+                  </pic:spPr>
+                </pic:pic>
+              </a:graphicData>
+            </a:graphic>
+          </wp:inline>
+        </w:drawing>
+      </w:r>
+    </w:p>
+    <w:p>
+      <w:r>
+        <w:drawing>
+          <wp:inline distT="0" distB="0" distL="0" distR="0" wp14:anchorId="220BFAFA" wp14:editId="6043E6B2">
+            <wp:extent cx="5731510" cy="2242185"/>
+            <wp:effectExtent l="0" t="0" r="2540" b="5715"/>
+            <wp:docPr id="295628675" name="Picture 1"/>
+            <wp:cNvGraphicFramePr>
+              <a:graphicFrameLocks xmlns:a="http://schemas.openxmlformats.org/drawingml/2006/main" noChangeAspect="1"/>
+            </wp:cNvGraphicFramePr>
+            <a:graphic xmlns:a="http://schemas.openxmlformats.org/drawingml/2006/main">
+              <a:graphicData uri="http://schemas.openxmlformats.org/drawingml/2006/picture">
+                <pic:pic xmlns:pic="http://schemas.openxmlformats.org/drawingml/2006/picture">
+                  <pic:nvPicPr>
+                    <pic:cNvPr id="295628675" name=""/>
+                    <pic:cNvPicPr/>
+                  </pic:nvPicPr>
+                  <pic:blipFill>
+                    <a:blip r:embed="rId34"/>
+                    <a:stretch>
+                      <a:fillRect/>
+                    </a:stretch>
+                  </pic:blipFill>
+                  <pic:spPr>
+                    <a:xfrm>
+                      <a:off x="0" y="0"/>
+                      <a:ext cx="5731510" cy="2242185"/>
+                    </a:xfrm>
+                    <a:prstGeom prst="rect">
+                      <a:avLst/>
+                    </a:prstGeom>
+                  </pic:spPr>
+                </pic:pic>
+              </a:graphicData>
+            </a:graphic>
+          </wp:inline>
+        </w:drawing>
+      </w:r>
+    </w:p>
+    <w:p>
+      <w:r>
+        <w:lastRenderedPageBreak/>
+        <w:drawing>
+          <wp:inline distT="0" distB="0" distL="0" distR="0" wp14:anchorId="2BC244C5" wp14:editId="56D5137B">
+            <wp:extent cx="5197290" cy="4938188"/>
+            <wp:effectExtent l="0" t="0" r="3810" b="0"/>
+            <wp:docPr id="1479759521" name="Picture 1"/>
+            <wp:cNvGraphicFramePr>
+              <a:graphicFrameLocks xmlns:a="http://schemas.openxmlformats.org/drawingml/2006/main" noChangeAspect="1"/>
+            </wp:cNvGraphicFramePr>
+            <a:graphic xmlns:a="http://schemas.openxmlformats.org/drawingml/2006/main">
+              <a:graphicData uri="http://schemas.openxmlformats.org/drawingml/2006/picture">
+                <pic:pic xmlns:pic="http://schemas.openxmlformats.org/drawingml/2006/picture">
+                  <pic:nvPicPr>
+                    <pic:cNvPr id="1479759521" name=""/>
+                    <pic:cNvPicPr/>
+                  </pic:nvPicPr>
+                  <pic:blipFill>
+                    <a:blip r:embed="rId35"/>
+                    <a:stretch>
+                      <a:fillRect/>
+                    </a:stretch>
+                  </pic:blipFill>
+                  <pic:spPr>
+                    <a:xfrm>
+                      <a:off x="0" y="0"/>
+                      <a:ext cx="5197290" cy="4938188"/>
+                    </a:xfrm>
+                    <a:prstGeom prst="rect">
+                      <a:avLst/>
+                    </a:prstGeom>
+                  </pic:spPr>
+                </pic:pic>
+              </a:graphicData>
+            </a:graphic>
+          </wp:inline>
+        </w:drawing>
+      </w:r>
+    </w:p>
     <w:p/>
+    <w:p>
+      <w:r>
+        <w:drawing>
+          <wp:inline distT="0" distB="0" distL="0" distR="0" wp14:anchorId="680618AB" wp14:editId="2978D6F2">
+            <wp:extent cx="5731510" cy="2674620"/>
+            <wp:effectExtent l="0" t="0" r="2540" b="0"/>
+            <wp:docPr id="712626848" name="Picture 1"/>
+            <wp:cNvGraphicFramePr>
+              <a:graphicFrameLocks xmlns:a="http://schemas.openxmlformats.org/drawingml/2006/main" noChangeAspect="1"/>
+            </wp:cNvGraphicFramePr>
+            <a:graphic xmlns:a="http://schemas.openxmlformats.org/drawingml/2006/main">
+              <a:graphicData uri="http://schemas.openxmlformats.org/drawingml/2006/picture">
+                <pic:pic xmlns:pic="http://schemas.openxmlformats.org/drawingml/2006/picture">
+                  <pic:nvPicPr>
+                    <pic:cNvPr id="712626848" name=""/>
+                    <pic:cNvPicPr/>
+                  </pic:nvPicPr>
+                  <pic:blipFill>
+                    <a:blip r:embed="rId36"/>
+                    <a:stretch>
+                      <a:fillRect/>
+                    </a:stretch>
+                  </pic:blipFill>
+                  <pic:spPr>
+                    <a:xfrm>
+                      <a:off x="0" y="0"/>
+                      <a:ext cx="5731510" cy="2674620"/>
+                    </a:xfrm>
+                    <a:prstGeom prst="rect">
+                      <a:avLst/>
+                    </a:prstGeom>
+                  </pic:spPr>
+                </pic:pic>
+              </a:graphicData>
+            </a:graphic>
+          </wp:inline>
+        </w:drawing>
+      </w:r>
+    </w:p>
     <w:sectPr>
       <w:pgSz w:w="11906" w:h="16838"/>
       <w:pgMar w:top="1440" w:right="1440" w:bottom="1440" w:left="1440" w:header="708" w:footer="708" w:gutter="0"/>

</xml_diff>

<commit_message>
Add part A and part B
</commit_message>
<xml_diff>
--- a/LABlogbook.docx
+++ b/LABlogbook.docx
@@ -26,6 +26,13 @@
           <w:szCs w:val="44"/>
         </w:rPr>
       </w:pPr>
+      <w:r>
+        <w:rPr>
+          <w:sz w:val="44"/>
+          <w:szCs w:val="44"/>
+        </w:rPr>
+        <w:t>SID 2520175</w:t>
+      </w:r>
     </w:p>
     <w:p>
       <w:pPr>
@@ -2190,6 +2197,9 @@
     </w:p>
     <w:p>
       <w:r>
+        <w:rPr>
+          <w:noProof/>
+        </w:rPr>
         <w:drawing>
           <wp:inline distT="0" distB="0" distL="0" distR="0" wp14:anchorId="3A10CF1B" wp14:editId="78E88CBB">
             <wp:extent cx="5731510" cy="3188335"/>
@@ -2229,6 +2239,9 @@
     </w:p>
     <w:p>
       <w:r>
+        <w:rPr>
+          <w:noProof/>
+        </w:rPr>
         <w:drawing>
           <wp:inline distT="0" distB="0" distL="0" distR="0" wp14:anchorId="3143A669" wp14:editId="04505016">
             <wp:extent cx="5731510" cy="1621155"/>
@@ -2268,6 +2281,9 @@
     </w:p>
     <w:p>
       <w:r>
+        <w:rPr>
+          <w:noProof/>
+        </w:rPr>
         <w:lastRenderedPageBreak/>
         <w:drawing>
           <wp:inline distT="0" distB="0" distL="0" distR="0" wp14:anchorId="12AF0BEB" wp14:editId="683078A4">
@@ -2308,6 +2324,9 @@
     </w:p>
     <w:p>
       <w:r>
+        <w:rPr>
+          <w:noProof/>
+        </w:rPr>
         <w:drawing>
           <wp:inline distT="0" distB="0" distL="0" distR="0" wp14:anchorId="220BFAFA" wp14:editId="6043E6B2">
             <wp:extent cx="5731510" cy="2242185"/>
@@ -2347,6 +2366,9 @@
     </w:p>
     <w:p>
       <w:r>
+        <w:rPr>
+          <w:noProof/>
+        </w:rPr>
         <w:lastRenderedPageBreak/>
         <w:drawing>
           <wp:inline distT="0" distB="0" distL="0" distR="0" wp14:anchorId="2BC244C5" wp14:editId="56D5137B">
@@ -2388,6 +2410,9 @@
     <w:p/>
     <w:p>
       <w:r>
+        <w:rPr>
+          <w:noProof/>
+        </w:rPr>
         <w:drawing>
           <wp:inline distT="0" distB="0" distL="0" distR="0" wp14:anchorId="680618AB" wp14:editId="2978D6F2">
             <wp:extent cx="5731510" cy="2674620"/>

</xml_diff>